<commit_message>
Add Responsible AI panel to CV
</commit_message>
<xml_diff>
--- a/assets/files/jaxsen-day-cv-2026.docx
+++ b/assets/files/jaxsen-day-cv-2026.docx
@@ -1233,6 +1233,31 @@
           <w:bCs/>
         </w:rPr>
         <w:t xml:space="preserve">Other Presentations</w:t>
+      </w:r>
+    </w:p>
+    <w:p/>
+    <w:p>
+      <w:pPr>
+        <w:spacing w:after="60" w:before="60"/>
+      </w:pPr>
+      <w:r>
+        <w:rPr>
+          <w:rFonts w:ascii="Times New Roman" w:hAnsi="Times New Roman"/>
+        </w:rPr>
+        <w:t xml:space="preserve">Day, J. R. (2026). Responsible AI for Education: Student Panel. Panelist. </w:t>
+      </w:r>
+      <w:r>
+        <w:rPr>
+          <w:rFonts w:ascii="Times New Roman" w:hAnsi="Times New Roman"/>
+          <w:i/>
+        </w:rPr>
+        <w:t>Responsible AI for Education 2026</w:t>
+      </w:r>
+      <w:r>
+        <w:rPr>
+          <w:rFonts w:ascii="Times New Roman" w:hAnsi="Times New Roman"/>
+        </w:rPr>
+        <w:t>, The University of Texas at Austin, Texas Union (Shirley Bird Perry Ballroom), Austin, TX. April 21, 2026.</w:t>
       </w:r>
     </w:p>
     <w:p/>

</xml_diff>

<commit_message>
Update CV guest speaker entries
</commit_message>
<xml_diff>
--- a/assets/files/jaxsen-day-cv-2026.docx
+++ b/assets/files/jaxsen-day-cv-2026.docx
@@ -1559,7 +1559,40 @@
         <w:rPr>
           <w:rFonts w:ascii="Times New Roman" w:cs="Times New Roman" w:eastAsia="Times New Roman" w:hAnsi="Times New Roman"/>
         </w:rPr>
+        <w:t>· Guest Speaker, INF 385T: Accessible User Experience, November 10, 2022</w:t>
+      </w:r>
+    </w:p>
+    <w:p>
+      <w:pPr>
+        <w:spacing w:after="60" w:before="60"/>
+      </w:pPr>
+      <w:r>
+        <w:rPr>
+          <w:rFonts w:ascii="Times New Roman" w:cs="Times New Roman" w:eastAsia="Times New Roman" w:hAnsi="Times New Roman"/>
+        </w:rPr>
         <w:t xml:space="preserve">· Guest Speaker, INF 385T: Accessible User Experience, February 16, 2023</w:t>
+      </w:r>
+    </w:p>
+    <w:p>
+      <w:pPr>
+        <w:spacing w:after="60" w:before="60"/>
+      </w:pPr>
+      <w:r>
+        <w:rPr>
+          <w:rFonts w:ascii="Times New Roman" w:cs="Times New Roman" w:eastAsia="Times New Roman" w:hAnsi="Times New Roman"/>
+        </w:rPr>
+        <w:t>· Guest Speaker, INF 385T: Accessible User Experience, October 31, 2024</w:t>
+      </w:r>
+    </w:p>
+    <w:p>
+      <w:pPr>
+        <w:spacing w:after="60" w:before="60"/>
+      </w:pPr>
+      <w:r>
+        <w:rPr>
+          <w:rFonts w:ascii="Times New Roman" w:cs="Times New Roman" w:eastAsia="Times New Roman" w:hAnsi="Times New Roman"/>
+        </w:rPr>
+        <w:t>· Guest Speaker, INF 385T: Accessible User Experience, October 23, 2025</w:t>
       </w:r>
     </w:p>
     <w:p>

</xml_diff>